<commit_message>
Atualização no arquivo 'Documentacao_Testes.docx'
</commit_message>
<xml_diff>
--- a/DOCS/testes/Documentacao_Testes.docx
+++ b/DOCS/testes/Documentacao_Testes.docx
@@ -411,11 +411,9 @@
               <w:ind/>
               <w:rPr/>
             </w:pPr>
-            <w:r/>
             <w:r>
               <w:t xml:space="preserve">Apresentação da árvore conversacional guiada</w:t>
             </w:r>
-            <w:r/>
             <w:r/>
           </w:p>
         </w:tc>
@@ -432,11 +430,9 @@
               <w:ind/>
               <w:rPr/>
             </w:pPr>
-            <w:r/>
             <w:r>
               <w:t xml:space="preserve">O banco de dados de nós de navegação deve estar populado e acessível pelo sistema.</w:t>
             </w:r>
-            <w:r/>
             <w:r/>
           </w:p>
         </w:tc>
@@ -453,11 +449,9 @@
               <w:ind/>
               <w:rPr/>
             </w:pPr>
-            <w:r/>
             <w:r>
               <w:t xml:space="preserve">Acesso à aplicação de autoatendimento.</w:t>
             </w:r>
-            <w:r/>
             <w:r/>
           </w:p>
         </w:tc>
@@ -484,11 +478,7 @@
                 <w:highlight w:val="none"/>
               </w:rPr>
             </w:r>
-            <w:r>
-              <w:rPr>
-                <w:highlight w:val="none"/>
-              </w:rPr>
-            </w:r>
+            <w:r/>
           </w:p>
           <w:p>
             <w:pPr>
@@ -505,8 +495,11 @@
             <w:r>
               <w:t xml:space="preserve">Acessar a página inicial do chatbot.</w:t>
             </w:r>
-            <w:r/>
-            <w:r/>
+            <w:r>
+              <w:rPr>
+                <w:highlight w:val="none"/>
+              </w:rPr>
+            </w:r>
           </w:p>
           <w:p>
             <w:pPr>
@@ -521,7 +514,6 @@
             <w:r>
               <w:t xml:space="preserve">Verificar as opções de cursos/perfis exibidas no menu inicial.</w:t>
             </w:r>
-            <w:r/>
             <w:r/>
           </w:p>
           <w:p>
@@ -539,7 +531,11 @@
             <w:r>
               <w:t xml:space="preserve">Clicar em uma das opções de curso (ex: Desenvolvimento de Software Multiplataforma).</w:t>
             </w:r>
-            <w:r/>
+            <w:r>
+              <w:rPr>
+                <w:highlight w:val="none"/>
+              </w:rPr>
+            </w:r>
           </w:p>
           <w:p>
             <w:pPr>
@@ -558,11 +554,7 @@
                 <w:highlight w:val="none"/>
               </w:rPr>
             </w:r>
-            <w:r>
-              <w:rPr>
-                <w:highlight w:val="none"/>
-              </w:rPr>
-            </w:r>
+            <w:r/>
           </w:p>
         </w:tc>
         <w:tc>
@@ -578,11 +570,9 @@
               <w:ind/>
               <w:rPr/>
             </w:pPr>
-            <w:r/>
             <w:r>
               <w:t xml:space="preserve">O chatbot exibe o texto de boas-vindas e a árvore de menus hierárquicos interativos corretamente, mudando conforme o curso selecionado.</w:t>
             </w:r>
-            <w:r/>
             <w:r/>
           </w:p>
         </w:tc>
@@ -599,11 +589,9 @@
               <w:ind/>
               <w:rPr/>
             </w:pPr>
-            <w:r/>
             <w:r>
               <w:t xml:space="preserve">Árvore conversacional carregada perfeitamente com todas as opções de cursos e submenus funcionais.</w:t>
             </w:r>
-            <w:r/>
             <w:r/>
           </w:p>
         </w:tc>
@@ -621,11 +609,9 @@
               <w:jc w:val="center"/>
               <w:rPr/>
             </w:pPr>
-            <w:r/>
             <w:r>
               <w:t xml:space="preserve">Passou</w:t>
             </w:r>
-            <w:r/>
             <w:r/>
           </w:p>
         </w:tc>
@@ -717,11 +703,9 @@
               <w:ind/>
               <w:rPr/>
             </w:pPr>
-            <w:r/>
             <w:r>
               <w:t xml:space="preserve">O site deve estar publicado ou rodando localmente para acesso externo.</w:t>
             </w:r>
-            <w:r/>
             <w:r/>
           </w:p>
         </w:tc>
@@ -738,11 +722,9 @@
               <w:ind/>
               <w:rPr/>
             </w:pPr>
-            <w:r/>
             <w:r>
               <w:t xml:space="preserve">Acessar o site usando links via diferentes dispositivos (Desktop, Smartphone Android, Smartphone iOS e Tablet).</w:t>
             </w:r>
-            <w:r/>
             <w:r/>
           </w:p>
         </w:tc>
@@ -786,7 +768,6 @@
                 <w:highlight w:val="none"/>
               </w:rPr>
             </w:pPr>
-            <w:r/>
             <w:r>
               <w:t xml:space="preserve">1</w:t>
             </w:r>
@@ -796,8 +777,11 @@
             <w:r>
               <w:t xml:space="preserve">Abrir a aplicação em um navegador desktop.</w:t>
             </w:r>
-            <w:r/>
-            <w:r/>
+            <w:r>
+              <w:rPr>
+                <w:highlight w:val="none"/>
+              </w:rPr>
+            </w:r>
           </w:p>
           <w:p>
             <w:pPr>
@@ -822,7 +806,11 @@
                 <w:highlight w:val="none"/>
               </w:rPr>
             </w:r>
-            <w:r/>
+            <w:r>
+              <w:rPr>
+                <w:highlight w:val="none"/>
+              </w:rPr>
+            </w:r>
           </w:p>
           <w:p>
             <w:pPr>
@@ -842,7 +830,11 @@
             <w:r>
               <w:t xml:space="preserve">Acessar o sistema diretamente de um smartphone e interagir com o chat.</w:t>
             </w:r>
-            <w:r/>
+            <w:r>
+              <w:rPr>
+                <w:highlight w:val="none"/>
+              </w:rPr>
+            </w:r>
           </w:p>
           <w:p>
             <w:pPr>
@@ -861,11 +853,7 @@
                 <w:highlight w:val="none"/>
               </w:rPr>
             </w:r>
-            <w:r>
-              <w:rPr>
-                <w:highlight w:val="none"/>
-              </w:rPr>
-            </w:r>
+            <w:r/>
           </w:p>
         </w:tc>
         <w:tc>
@@ -881,11 +869,9 @@
               <w:ind/>
               <w:rPr/>
             </w:pPr>
-            <w:r/>
             <w:r>
               <w:t xml:space="preserve">A interface do chatbot deve ser fluida, clara, redimensionar perfeitamente e funcionar normalmente em todos os tamanhos de tela.</w:t>
             </w:r>
-            <w:r/>
             <w:r/>
           </w:p>
         </w:tc>
@@ -902,11 +888,9 @@
               <w:ind/>
               <w:rPr/>
             </w:pPr>
-            <w:r/>
             <w:r>
               <w:t xml:space="preserve">Interface totalmente responsiva e sem quebras de layout em múltiplos dispositivos.</w:t>
             </w:r>
-            <w:r/>
             <w:r/>
           </w:p>
         </w:tc>
@@ -947,17 +931,13 @@
             <w:r>
               <w:t xml:space="preserve">Realizado por: </w:t>
             </w:r>
-            <w:r/>
             <w:r>
               <w:t xml:space="preserve">Felipe</w:t>
             </w:r>
-            <w:r/>
-            <w:r/>
             <w:r>
               <w:br/>
               <w:t xml:space="preserve">Data: </w:t>
             </w:r>
-            <w:r/>
             <w:r>
               <w:t xml:space="preserve">0</w:t>
             </w:r>
@@ -970,9 +950,6 @@
             <w:r>
               <w:t xml:space="preserve">6</w:t>
             </w:r>
-            <w:r/>
-            <w:r/>
-            <w:r/>
             <w:r/>
           </w:p>
         </w:tc>
@@ -1014,12 +991,9 @@
               <w:ind/>
               <w:rPr/>
             </w:pPr>
-            <w:r/>
-            <w:r/>
             <w:r>
               <w:t xml:space="preserve">Consulta direta com retorno de respostas e evidências documentais (Repositório)</w:t>
             </w:r>
-            <w:r/>
             <w:r/>
           </w:p>
         </w:tc>
@@ -1036,11 +1010,9 @@
               <w:ind/>
               <w:rPr/>
             </w:pPr>
-            <w:r/>
             <w:r>
               <w:t xml:space="preserve">O sistema deve ter os documentos oficiais cadastrados com trechos (chunks) e metadados indexados.</w:t>
             </w:r>
-            <w:r/>
             <w:r/>
           </w:p>
         </w:tc>
@@ -1057,11 +1029,9 @@
               <w:ind/>
               <w:rPr/>
             </w:pPr>
-            <w:r/>
             <w:r>
               <w:t xml:space="preserve">Seleção de menu "Dispensa de disciplinas" -&gt; "Aproveitamento de estudos".</w:t>
             </w:r>
-            <w:r/>
             <w:r/>
           </w:p>
         </w:tc>
@@ -1088,11 +1058,7 @@
                 <w:highlight w:val="none"/>
               </w:rPr>
             </w:r>
-            <w:r>
-              <w:rPr>
-                <w:highlight w:val="none"/>
-              </w:rPr>
-            </w:r>
+            <w:r/>
           </w:p>
           <w:p>
             <w:pPr>
@@ -1106,12 +1072,14 @@
             <w:r>
               <w:t xml:space="preserve">1.</w:t>
             </w:r>
-            <w:r/>
             <w:r>
               <w:t xml:space="preserve">Iniciar atendimento como Aluno.</w:t>
             </w:r>
-            <w:r/>
-            <w:r/>
+            <w:r>
+              <w:rPr>
+                <w:highlight w:val="none"/>
+              </w:rPr>
+            </w:r>
           </w:p>
           <w:p>
             <w:pPr>
@@ -1126,7 +1094,6 @@
             <w:r>
               <w:t xml:space="preserve">Escolher o curso "Desenvolvimento de Software Multiplataforma".</w:t>
             </w:r>
-            <w:r/>
             <w:r/>
           </w:p>
           <w:p>
@@ -1144,7 +1111,11 @@
             <w:r>
               <w:t xml:space="preserve">Clicar no menu "Dispensa de disciplinas" e depois em "Aproveitamento de estudos".</w:t>
             </w:r>
-            <w:r/>
+            <w:r>
+              <w:rPr>
+                <w:highlight w:val="none"/>
+              </w:rPr>
+            </w:r>
           </w:p>
           <w:p>
             <w:pPr>
@@ -1163,11 +1134,7 @@
                 <w:highlight w:val="none"/>
               </w:rPr>
             </w:r>
-            <w:r>
-              <w:rPr>
-                <w:highlight w:val="none"/>
-              </w:rPr>
-            </w:r>
+            <w:r/>
           </w:p>
         </w:tc>
         <w:tc>
@@ -1183,7 +1150,6 @@
               <w:ind/>
               <w:rPr/>
             </w:pPr>
-            <w:r/>
             <w:r>
               <w:t xml:space="preserve">O sistema deve retornar a resposta padronizada e exibir o trecho original com a indicação da fonte</w:t>
             </w:r>
@@ -1206,11 +1172,9 @@
               <w:ind/>
               <w:rPr/>
             </w:pPr>
-            <w:r/>
             <w:r>
               <w:t xml:space="preserve">Resposta gerada com clareza contendo o link e o trecho de metadados correspondente à norma acadêmica.</w:t>
             </w:r>
-            <w:r/>
             <w:r/>
           </w:p>
         </w:tc>
@@ -1251,19 +1215,15 @@
             <w:r>
               <w:t xml:space="preserve">Realizado por: </w:t>
             </w:r>
-            <w:r/>
             <w:r>
               <w:t xml:space="preserve">Felipe</w:t>
             </w:r>
-            <w:r/>
-            <w:r/>
             <w:r>
               <w:br/>
             </w:r>
             <w:r>
               <w:t xml:space="preserve">Data: </w:t>
             </w:r>
-            <w:r/>
             <w:r>
               <w:t xml:space="preserve">0</w:t>
             </w:r>
@@ -1276,9 +1236,6 @@
             <w:r>
               <w:t xml:space="preserve">6</w:t>
             </w:r>
-            <w:r/>
-            <w:r/>
-            <w:r/>
             <w:r/>
           </w:p>
         </w:tc>
@@ -1308,7 +1265,6 @@
               <w:t xml:space="preserve">04</w:t>
             </w:r>
             <w:r/>
-            <w:r/>
           </w:p>
         </w:tc>
         <w:tc>
@@ -1324,11 +1280,9 @@
               <w:ind/>
               <w:rPr/>
             </w:pPr>
-            <w:r/>
             <w:r>
               <w:t xml:space="preserve">Acesso público ao autoatendimento para o perfil Aluno</w:t>
             </w:r>
-            <w:r/>
             <w:r/>
           </w:p>
         </w:tc>
@@ -1345,11 +1299,9 @@
               <w:ind/>
               <w:rPr/>
             </w:pPr>
-            <w:r/>
             <w:r>
               <w:t xml:space="preserve">O usuário não deve estar autenticado em nenhuma conta do sistema.</w:t>
             </w:r>
-            <w:r/>
             <w:r/>
           </w:p>
         </w:tc>
@@ -1366,11 +1318,9 @@
               <w:ind/>
               <w:rPr/>
             </w:pPr>
-            <w:r/>
             <w:r>
               <w:t xml:space="preserve">URL da aplicação web (área pública).</w:t>
             </w:r>
-            <w:r/>
             <w:r/>
           </w:p>
         </w:tc>
@@ -1397,6 +1347,23 @@
                 <w:highlight w:val="none"/>
               </w:rPr>
             </w:r>
+            <w:r/>
+          </w:p>
+          <w:p>
+            <w:pPr>
+              <w:pBdr/>
+              <w:spacing/>
+              <w:ind/>
+              <w:rPr>
+                <w:highlight w:val="none"/>
+              </w:rPr>
+            </w:pPr>
+            <w:r>
+              <w:t xml:space="preserve">1.</w:t>
+            </w:r>
+            <w:r>
+              <w:t xml:space="preserve">Acessar o link principal do chatbot.</w:t>
+            </w:r>
             <w:r>
               <w:rPr>
                 <w:highlight w:val="none"/>
@@ -1413,30 +1380,16 @@
               </w:rPr>
             </w:pPr>
             <w:r>
-              <w:t xml:space="preserve">1.</w:t>
-            </w:r>
-            <w:r>
-              <w:t xml:space="preserve">Acessar o link principal do chatbot.</w:t>
-            </w:r>
-            <w:r/>
-            <w:r/>
-          </w:p>
-          <w:p>
-            <w:pPr>
-              <w:pBdr/>
-              <w:spacing/>
-              <w:ind/>
-              <w:rPr>
-                <w:highlight w:val="none"/>
-              </w:rPr>
-            </w:pPr>
-            <w:r>
               <w:t xml:space="preserve">2.</w:t>
             </w:r>
             <w:r>
               <w:t xml:space="preserve">Navegar pelos menus de cursos (DSM, Geoprocessamento, MARH).</w:t>
             </w:r>
-            <w:r/>
+            <w:r>
+              <w:rPr>
+                <w:highlight w:val="none"/>
+              </w:rPr>
+            </w:r>
           </w:p>
           <w:p>
             <w:pPr>
@@ -1455,11 +1408,7 @@
                 <w:highlight w:val="none"/>
               </w:rPr>
             </w:r>
-            <w:r>
-              <w:rPr>
-                <w:highlight w:val="none"/>
-              </w:rPr>
-            </w:r>
+            <w:r/>
           </w:p>
         </w:tc>
         <w:tc>
@@ -1475,11 +1424,9 @@
               <w:ind/>
               <w:rPr/>
             </w:pPr>
-            <w:r/>
             <w:r>
               <w:t xml:space="preserve">O sistema permite a navegação e consulta de todas as dúvidas sem solicitar login ou token de autenticação.</w:t>
             </w:r>
-            <w:r/>
             <w:r/>
           </w:p>
         </w:tc>
@@ -1496,11 +1443,9 @@
               <w:ind/>
               <w:rPr/>
             </w:pPr>
-            <w:r/>
             <w:r>
               <w:t xml:space="preserve">Navegação pública liberada e estável em todos os fluxos de perguntas e respostas.</w:t>
             </w:r>
-            <w:r/>
             <w:r/>
           </w:p>
         </w:tc>
@@ -1521,10 +1466,6 @@
             <w:r>
               <w:t xml:space="preserve">Passou</w:t>
             </w:r>
-            <w:r/>
-            <w:r/>
-            <w:r/>
-            <w:r/>
             <w:r/>
           </w:p>
         </w:tc>
@@ -1548,15 +1489,10 @@
             <w:r>
               <w:t xml:space="preserve">Felipe</w:t>
             </w:r>
-            <w:r/>
-            <w:r/>
             <w:r>
               <w:br/>
               <w:t xml:space="preserve">Data: </w:t>
             </w:r>
-            <w:r/>
-            <w:r/>
-            <w:r/>
             <w:r>
               <w:t xml:space="preserve">0</w:t>
             </w:r>
@@ -1566,10 +1502,6 @@
             <w:r>
               <w:t xml:space="preserve">6</w:t>
             </w:r>
-            <w:r/>
-            <w:r/>
-            <w:r/>
-            <w:r/>
             <w:r>
               <w:t xml:space="preserve">/2026</w:t>
             </w:r>
@@ -1639,7 +1571,6 @@
               <w:t xml:space="preserve">05</w:t>
             </w:r>
             <w:r/>
-            <w:r/>
           </w:p>
           <w:p>
             <w:pPr>
@@ -1667,11 +1598,9 @@
               <w:ind/>
               <w:rPr/>
             </w:pPr>
-            <w:r/>
             <w:r>
               <w:t xml:space="preserve">Gestão de menus e respostas pelo painel do Administrador</w:t>
             </w:r>
-            <w:r/>
             <w:r/>
           </w:p>
           <w:p>
@@ -1699,11 +1628,9 @@
               <w:ind/>
               <w:rPr/>
             </w:pPr>
-            <w:r/>
             <w:r>
               <w:t xml:space="preserve">Usuário logado com credenciais de Administrador.</w:t>
             </w:r>
-            <w:r/>
             <w:r/>
           </w:p>
           <w:p>
@@ -1731,11 +1658,9 @@
               <w:ind/>
               <w:rPr/>
             </w:pPr>
-            <w:r/>
             <w:r>
               <w:t xml:space="preserve">Novo submenu: "Estágio" -&gt; Novo sub-item: "Seguro Obrigatório" com o texto da resposta correspondente.</w:t>
             </w:r>
-            <w:r/>
             <w:r/>
           </w:p>
           <w:p>
@@ -1768,7 +1693,6 @@
                 <w:highlight w:val="none"/>
               </w:rPr>
             </w:r>
-            <w:r/>
             <w:r/>
           </w:p>
           <w:p>
@@ -1810,7 +1734,6 @@
             <w:r>
               <w:t xml:space="preserve">Ir até a aba "Gestão de Conteúdo / Árvore de Menus".</w:t>
             </w:r>
-            <w:r/>
             <w:r/>
           </w:p>
           <w:p>
@@ -1881,7 +1804,6 @@
               </w:rPr>
             </w:r>
             <w:r/>
-            <w:r/>
           </w:p>
           <w:p>
             <w:pPr>
@@ -1892,6 +1814,11 @@
                 <w:highlight w:val="none"/>
               </w:rPr>
             </w:pPr>
+            <w:r>
+              <w:rPr>
+                <w:highlight w:val="none"/>
+              </w:rPr>
+            </w:r>
             <w:r>
               <w:rPr>
                 <w:highlight w:val="none"/>
@@ -1918,11 +1845,9 @@
               <w:ind/>
               <w:rPr/>
             </w:pPr>
-            <w:r/>
             <w:r>
               <w:t xml:space="preserve">O menu deve ser inserido com sucesso no banco de dados e aparecer dinamicamente na árvore de navegação do robô.</w:t>
             </w:r>
-            <w:r/>
             <w:r/>
           </w:p>
           <w:p>
@@ -1950,11 +1875,9 @@
               <w:ind/>
               <w:rPr/>
             </w:pPr>
-            <w:r/>
             <w:r>
               <w:t xml:space="preserve">Criação de nós e submenus atualizados dinamicamente na interface sem lentidão.</w:t>
             </w:r>
-            <w:r/>
             <w:r/>
           </w:p>
           <w:p>
@@ -1981,11 +1904,41 @@
               <w:spacing/>
               <w:ind/>
               <w:jc w:val="center"/>
+              <w:rPr>
+                <w:highlight w:val="none"/>
+              </w:rPr>
+            </w:pPr>
+            <w:r>
+              <w:t xml:space="preserve">Falhou</w:t>
+            </w:r>
+            <w:r>
+              <w:rPr>
+                <w:highlight w:val="none"/>
+              </w:rPr>
+            </w:r>
+            <w:r>
+              <w:rPr>
+                <w:highlight w:val="none"/>
+              </w:rPr>
+            </w:r>
+          </w:p>
+          <w:p>
+            <w:pPr>
+              <w:pBdr/>
+              <w:spacing/>
+              <w:ind/>
+              <w:jc w:val="center"/>
               <w:rPr/>
             </w:pPr>
             <w:r>
-              <w:t xml:space="preserve">Passou</w:t>
+              <w:rPr>
+                <w:highlight w:val="none"/>
+              </w:rPr>
+              <w:t xml:space="preserve">####</w:t>
             </w:r>
+            <w:r/>
+            <w:r/>
+            <w:r/>
             <w:r/>
             <w:r/>
           </w:p>
@@ -2039,7 +1992,6 @@
               <w:t xml:space="preserve">/2026</w:t>
             </w:r>
             <w:r/>
-            <w:r/>
           </w:p>
           <w:p>
             <w:pPr>
@@ -2080,7 +2032,6 @@
               <w:t xml:space="preserve">06</w:t>
             </w:r>
             <w:r/>
-            <w:r/>
           </w:p>
           <w:p>
             <w:pPr>
@@ -2108,11 +2059,9 @@
               <w:ind/>
               <w:rPr/>
             </w:pPr>
-            <w:r/>
             <w:r>
               <w:t xml:space="preserve">Formulário de encaminhamento de dúvida não resolvida pelo Bot</w:t>
             </w:r>
-            <w:r/>
             <w:r/>
           </w:p>
           <w:p>
@@ -2140,11 +2089,9 @@
               <w:ind/>
               <w:rPr/>
             </w:pPr>
-            <w:r/>
             <w:r>
               <w:t xml:space="preserve">Navegar até o final de um fluxo de atendimento que não tenha sanado a dúvida do estudante.</w:t>
             </w:r>
-            <w:r/>
             <w:r/>
           </w:p>
           <w:p>
@@ -2172,11 +2119,9 @@
               <w:ind/>
               <w:rPr/>
             </w:pPr>
-            <w:r/>
             <w:r>
               <w:t xml:space="preserve">Texto da dúvida: "Gostaria de saber se o vestibular aceita nota do ENEM de 2025." | E-mail: aluno.teste@fatec.sp.gov.br.</w:t>
             </w:r>
-            <w:r/>
             <w:r/>
           </w:p>
           <w:p>
@@ -2209,7 +2154,6 @@
                 <w:highlight w:val="none"/>
               </w:rPr>
             </w:r>
-            <w:r/>
             <w:r/>
           </w:p>
           <w:p>
@@ -2252,7 +2196,6 @@
               <w:t xml:space="preserve">Preencher o campo de texto com a dúvida e inserir o e-mail institucional.</w:t>
             </w:r>
             <w:r/>
-            <w:r/>
           </w:p>
           <w:p>
             <w:pPr>
@@ -2293,7 +2236,6 @@
               </w:rPr>
             </w:r>
             <w:r/>
-            <w:r/>
           </w:p>
           <w:p>
             <w:pPr>
@@ -2304,6 +2246,11 @@
                 <w:highlight w:val="none"/>
               </w:rPr>
             </w:pPr>
+            <w:r>
+              <w:rPr>
+                <w:highlight w:val="none"/>
+              </w:rPr>
+            </w:r>
             <w:r>
               <w:rPr>
                 <w:highlight w:val="none"/>
@@ -2330,11 +2277,9 @@
               <w:ind/>
               <w:rPr/>
             </w:pPr>
-            <w:r/>
             <w:r>
               <w:t xml:space="preserve">O sistema exibe mensagem de sucesso, encerra o atendimento e armazena a pergunta para a secretaria.</w:t>
             </w:r>
-            <w:r/>
             <w:r/>
           </w:p>
           <w:p>
@@ -2362,11 +2307,9 @@
               <w:ind/>
               <w:rPr/>
             </w:pPr>
-            <w:r/>
             <w:r>
               <w:t xml:space="preserve">Dúvida gravada perfeitamente no banco de dados e notificação de sucesso enviada na tela.</w:t>
             </w:r>
-            <w:r/>
             <w:r/>
           </w:p>
           <w:p>
@@ -2398,7 +2341,6 @@
             <w:r>
               <w:t xml:space="preserve">Passou</w:t>
             </w:r>
-            <w:r/>
             <w:r/>
           </w:p>
           <w:p>
@@ -2451,7 +2393,6 @@
               <w:t xml:space="preserve">/2026</w:t>
             </w:r>
             <w:r/>
-            <w:r/>
           </w:p>
           <w:p>
             <w:pPr>
@@ -2525,7 +2466,6 @@
               <w:t xml:space="preserve">07</w:t>
             </w:r>
             <w:r/>
-            <w:r/>
           </w:p>
           <w:p>
             <w:pPr>
@@ -2553,11 +2493,9 @@
               <w:ind/>
               <w:rPr/>
             </w:pPr>
-            <w:r/>
             <w:r>
               <w:t xml:space="preserve">Listagem e alteração de status de perguntas pela Secretária Acadêmica</w:t>
             </w:r>
-            <w:r/>
             <w:r/>
           </w:p>
           <w:p>
@@ -2585,11 +2523,9 @@
               <w:ind/>
               <w:rPr/>
             </w:pPr>
-            <w:r/>
             <w:r>
               <w:t xml:space="preserve">Usuário autenticado com o perfil de "Secretária Acadêmica".</w:t>
             </w:r>
-            <w:r/>
             <w:r/>
           </w:p>
           <w:p>
@@ -2617,11 +2553,9 @@
               <w:ind/>
               <w:rPr/>
             </w:pPr>
-            <w:r/>
             <w:r>
               <w:t xml:space="preserve">Seleção de uma pergunta com status "Em aberto" e mudança para "Respondida".</w:t>
             </w:r>
-            <w:r/>
             <w:r/>
           </w:p>
           <w:p>
@@ -2654,7 +2588,6 @@
                 <w:highlight w:val="none"/>
               </w:rPr>
             </w:r>
-            <w:r/>
             <w:r/>
           </w:p>
           <w:p>
@@ -2697,7 +2630,6 @@
               <w:t xml:space="preserve">Acessar o módulo de "Gestão de Perguntas".</w:t>
             </w:r>
             <w:r/>
-            <w:r/>
           </w:p>
           <w:p>
             <w:pPr>
@@ -2738,7 +2670,6 @@
               </w:rPr>
             </w:r>
             <w:r/>
-            <w:r/>
           </w:p>
           <w:p>
             <w:pPr>
@@ -2749,6 +2680,11 @@
                 <w:highlight w:val="none"/>
               </w:rPr>
             </w:pPr>
+            <w:r>
+              <w:rPr>
+                <w:highlight w:val="none"/>
+              </w:rPr>
+            </w:r>
             <w:r>
               <w:rPr>
                 <w:highlight w:val="none"/>
@@ -2775,11 +2711,9 @@
               <w:ind/>
               <w:rPr/>
             </w:pPr>
-            <w:r/>
             <w:r>
               <w:t xml:space="preserve">A lista deve atualizar instantaneamente e gravar a nova situação da pergunta no repositório.</w:t>
             </w:r>
-            <w:r/>
             <w:r/>
           </w:p>
           <w:p>
@@ -2807,11 +2741,9 @@
               <w:ind/>
               <w:rPr/>
             </w:pPr>
-            <w:r/>
             <w:r>
               <w:t xml:space="preserve">Filtro de listagem e alteração de estados processados de forma rápida e precisa.</w:t>
             </w:r>
-            <w:r/>
             <w:r/>
           </w:p>
           <w:p>
@@ -2843,7 +2775,6 @@
             <w:r>
               <w:t xml:space="preserve">Passou</w:t>
             </w:r>
-            <w:r/>
             <w:r/>
           </w:p>
           <w:p>
@@ -2896,7 +2827,6 @@
               <w:t xml:space="preserve">/2026</w:t>
             </w:r>
             <w:r/>
-            <w:r/>
           </w:p>
           <w:p>
             <w:pPr>
@@ -2937,7 +2867,6 @@
               <w:t xml:space="preserve">08</w:t>
             </w:r>
             <w:r/>
-            <w:r/>
           </w:p>
           <w:p>
             <w:pPr>
@@ -2965,11 +2894,9 @@
               <w:ind/>
               <w:rPr/>
             </w:pPr>
-            <w:r/>
             <w:r>
               <w:t xml:space="preserve">Registro de feedback ("Gostei" / "Não gostei") pelo usuário</w:t>
             </w:r>
-            <w:r/>
             <w:r/>
           </w:p>
           <w:p>
@@ -2997,11 +2924,9 @@
               <w:ind/>
               <w:rPr/>
             </w:pPr>
-            <w:r/>
             <w:r>
               <w:t xml:space="preserve">Conclusão de uma jornada de respostas completada pelo robô.</w:t>
             </w:r>
-            <w:r/>
             <w:r/>
           </w:p>
           <w:p>
@@ -3029,11 +2954,9 @@
               <w:ind/>
               <w:rPr/>
             </w:pPr>
-            <w:r/>
             <w:r>
               <w:t xml:space="preserve">Clique no botão de reação positiva ("Gostei" / Ícone de Joinha).</w:t>
             </w:r>
-            <w:r/>
             <w:r/>
           </w:p>
           <w:p>
@@ -3066,7 +2989,6 @@
                 <w:highlight w:val="none"/>
               </w:rPr>
             </w:r>
-            <w:r/>
             <w:r/>
           </w:p>
           <w:p>
@@ -3134,7 +3056,6 @@
               </w:rPr>
             </w:r>
             <w:r/>
-            <w:r/>
           </w:p>
           <w:p>
             <w:pPr>
@@ -3145,6 +3066,11 @@
                 <w:highlight w:val="none"/>
               </w:rPr>
             </w:pPr>
+            <w:r>
+              <w:rPr>
+                <w:highlight w:val="none"/>
+              </w:rPr>
+            </w:r>
             <w:r>
               <w:rPr>
                 <w:highlight w:val="none"/>
@@ -3171,11 +3097,9 @@
               <w:ind/>
               <w:rPr/>
             </w:pPr>
-            <w:r/>
             <w:r>
               <w:t xml:space="preserve">O sistema computa o voto, desabilita os botões para evitar duplo clique e exibe um agradecimento.</w:t>
             </w:r>
-            <w:r/>
             <w:r/>
           </w:p>
           <w:p>
@@ -3203,11 +3127,9 @@
               <w:ind/>
               <w:rPr/>
             </w:pPr>
-            <w:r/>
             <w:r>
               <w:t xml:space="preserve">Feedback registrado com sucesso atrelando o voto ao ID da interação corrente.</w:t>
             </w:r>
-            <w:r/>
             <w:r/>
           </w:p>
           <w:p>
@@ -3239,7 +3161,6 @@
             <w:r>
               <w:t xml:space="preserve">Passou</w:t>
             </w:r>
-            <w:r/>
             <w:r/>
           </w:p>
           <w:p>
@@ -3292,7 +3213,6 @@
               <w:t xml:space="preserve">/2026</w:t>
             </w:r>
             <w:r/>
-            <w:r/>
           </w:p>
           <w:p>
             <w:pPr>
@@ -3366,7 +3286,6 @@
               <w:t xml:space="preserve">09</w:t>
             </w:r>
             <w:r/>
-            <w:r/>
           </w:p>
           <w:p>
             <w:pPr>
@@ -3394,11 +3313,9 @@
               <w:ind/>
               <w:rPr/>
             </w:pPr>
-            <w:r/>
             <w:r>
               <w:t xml:space="preserve">Gravação de trilha de logs detalhada no banco de dados</w:t>
             </w:r>
-            <w:r/>
             <w:r/>
           </w:p>
           <w:p>
@@ -3426,11 +3343,9 @@
               <w:ind/>
               <w:rPr/>
             </w:pPr>
-            <w:r/>
             <w:r>
               <w:t xml:space="preserve">Realizar qualquer atendimento na interface do Aluno.</w:t>
             </w:r>
-            <w:r/>
             <w:r/>
           </w:p>
           <w:p>
@@ -3458,11 +3373,9 @@
               <w:ind/>
               <w:rPr/>
             </w:pPr>
-            <w:r/>
             <w:r>
               <w:t xml:space="preserve">Fluxo de cliques realizados durante a sessão de teste.</w:t>
             </w:r>
-            <w:r/>
             <w:r/>
           </w:p>
           <w:p>
@@ -3495,7 +3408,6 @@
                 <w:highlight w:val="none"/>
               </w:rPr>
             </w:r>
-            <w:r/>
             <w:r/>
           </w:p>
           <w:p>
@@ -3538,7 +3450,6 @@
               <w:t xml:space="preserve">Avaliar o atendimento.</w:t>
             </w:r>
             <w:r/>
-            <w:r/>
           </w:p>
           <w:p>
             <w:pPr>
@@ -3579,7 +3490,6 @@
               </w:rPr>
             </w:r>
             <w:r/>
-            <w:r/>
           </w:p>
           <w:p>
             <w:pPr>
@@ -3590,6 +3500,11 @@
                 <w:highlight w:val="none"/>
               </w:rPr>
             </w:pPr>
+            <w:r>
+              <w:rPr>
+                <w:highlight w:val="none"/>
+              </w:rPr>
+            </w:r>
             <w:r>
               <w:rPr>
                 <w:highlight w:val="none"/>
@@ -3616,11 +3531,9 @@
               <w:ind/>
               <w:rPr/>
             </w:pPr>
-            <w:r/>
             <w:r>
               <w:t xml:space="preserve">O registro de logs deve conter o carimbo de data/hora, caminho dos nós clicados, pergunta enviada (se houver) e a nota de satisfação.</w:t>
             </w:r>
-            <w:r/>
             <w:r/>
           </w:p>
           <w:p>
@@ -3648,11 +3561,9 @@
               <w:ind/>
               <w:rPr/>
             </w:pPr>
-            <w:r/>
             <w:r>
               <w:t xml:space="preserve">Logs estruturados perfeitamente gravados com timestamp e o payload exato da árvore de decisão.</w:t>
             </w:r>
-            <w:r/>
             <w:r/>
           </w:p>
           <w:p>
@@ -3684,7 +3595,6 @@
             <w:r>
               <w:t xml:space="preserve">Passou</w:t>
             </w:r>
-            <w:r/>
             <w:r/>
           </w:p>
           <w:p>
@@ -3737,7 +3647,6 @@
               <w:t xml:space="preserve">/2026</w:t>
             </w:r>
             <w:r/>
-            <w:r/>
           </w:p>
           <w:p>
             <w:pPr>
@@ -3778,7 +3687,6 @@
               <w:t xml:space="preserve">10</w:t>
             </w:r>
             <w:r/>
-            <w:r/>
           </w:p>
           <w:p>
             <w:pPr>
@@ -3806,11 +3714,9 @@
               <w:ind/>
               <w:rPr/>
             </w:pPr>
-            <w:r/>
             <w:r>
               <w:t xml:space="preserve">Impedir secretária de acessar funções restritas ao administrador</w:t>
             </w:r>
-            <w:r/>
             <w:r/>
           </w:p>
           <w:p>
@@ -3838,11 +3744,9 @@
               <w:ind/>
               <w:rPr/>
             </w:pPr>
-            <w:r/>
             <w:r>
               <w:t xml:space="preserve">Usuário logado com o papel "Secretária Acadêmica".</w:t>
             </w:r>
-            <w:r/>
             <w:r/>
           </w:p>
           <w:p>
@@ -3870,11 +3774,9 @@
               <w:ind/>
               <w:rPr/>
             </w:pPr>
-            <w:r/>
             <w:r>
               <w:t xml:space="preserve">Tentativa de acesso direto via menu ou URL à área de "Gestão de Usuários da Secretaria" ou "Edição de Menus".</w:t>
             </w:r>
-            <w:r/>
             <w:r/>
           </w:p>
           <w:p>
@@ -3909,7 +3811,6 @@
               <w:t xml:space="preserve">Fazer o login como Secretaria.</w:t>
             </w:r>
             <w:r/>
-            <w:r/>
           </w:p>
           <w:p>
             <w:pPr>
@@ -3925,7 +3826,6 @@
               <w:t xml:space="preserve">Tentar forçar a navegação para a rota /admin/usuarios ou clicar em opções exclusivas do Admin.</w:t>
             </w:r>
             <w:r/>
-            <w:r/>
           </w:p>
           <w:p>
             <w:pPr>
@@ -3936,6 +3836,11 @@
                 <w:highlight w:val="none"/>
               </w:rPr>
             </w:pPr>
+            <w:r>
+              <w:rPr>
+                <w:highlight w:val="none"/>
+              </w:rPr>
+            </w:r>
             <w:r>
               <w:rPr>
                 <w:highlight w:val="none"/>
@@ -3964,7 +3869,6 @@
                 <w:highlight w:val="none"/>
               </w:rPr>
             </w:pPr>
-            <w:r/>
             <w:r>
               <w:t xml:space="preserve">O sistema bloqueia a ação, impede a renderização dos componentes administrativos e exibe uma mensagem de "Acesso Negado".</w:t>
             </w:r>
@@ -4004,11 +3908,9 @@
               <w:ind/>
               <w:rPr/>
             </w:pPr>
-            <w:r/>
             <w:r>
               <w:t xml:space="preserve">O controle RBAC barrou o acesso não autorizado de forma imediata mantendo a integridade do sistema.</w:t>
             </w:r>
-            <w:r/>
             <w:r/>
           </w:p>
           <w:p>
@@ -4035,13 +3937,39 @@
               <w:spacing/>
               <w:ind/>
               <w:jc w:val="center"/>
+              <w:rPr>
+                <w:highlight w:val="none"/>
+              </w:rPr>
+            </w:pPr>
+            <w:r>
+              <w:t xml:space="preserve">Falhou</w:t>
+            </w:r>
+            <w:r/>
+          </w:p>
+          <w:p>
+            <w:pPr>
+              <w:pBdr/>
+              <w:spacing/>
+              <w:ind/>
+              <w:jc w:val="center"/>
               <w:rPr/>
             </w:pPr>
             <w:r>
-              <w:t xml:space="preserve">Passou</w:t>
+              <w:rPr>
+                <w:highlight w:val="none"/>
+              </w:rPr>
+              <w:t xml:space="preserve">####</w:t>
             </w:r>
-            <w:r/>
-            <w:r/>
+            <w:r>
+              <w:rPr>
+                <w:highlight w:val="none"/>
+              </w:rPr>
+            </w:r>
+            <w:r>
+              <w:rPr>
+                <w:highlight w:val="none"/>
+              </w:rPr>
+            </w:r>
           </w:p>
           <w:p>
             <w:pPr>
@@ -4093,7 +4021,6 @@
               <w:t xml:space="preserve">/2026</w:t>
             </w:r>
             <w:r/>
-            <w:r/>
           </w:p>
           <w:p>
             <w:pPr>
@@ -4117,9 +4044,6 @@
         <w:rPr/>
       </w:pPr>
       <w:r/>
-      <w:r>
-        <w:t xml:space="preserve">Realizado por: FelipeData: 08/06/2026</w:t>
-      </w:r>
       <w:r>
         <w:br w:type="page" w:clear="all"/>
       </w:r>
@@ -4171,7 +4095,6 @@
               <w:t xml:space="preserve">11</w:t>
             </w:r>
             <w:r/>
-            <w:r/>
           </w:p>
           <w:p>
             <w:pPr>
@@ -4199,11 +4122,9 @@
               <w:ind/>
               <w:rPr/>
             </w:pPr>
-            <w:r/>
             <w:r>
               <w:t xml:space="preserve">Proteção de endpoints do Backend por middleware de validação JWT</w:t>
             </w:r>
-            <w:r/>
             <w:r/>
           </w:p>
           <w:p>
@@ -4231,11 +4152,9 @@
               <w:ind/>
               <w:rPr/>
             </w:pPr>
-            <w:r/>
             <w:r>
               <w:t xml:space="preserve">Servidor Backend ativo. Nenhuma autenticação enviada na requisição HTTP.</w:t>
             </w:r>
-            <w:r/>
             <w:r/>
           </w:p>
           <w:p>
@@ -4263,11 +4182,9 @@
               <w:ind/>
               <w:rPr/>
             </w:pPr>
-            <w:r/>
             <w:r>
               <w:t xml:space="preserve">Requisição direta via software de testes (ex: Postman/Insomnia) para a rota GET /api/v1/admin/logs.</w:t>
             </w:r>
-            <w:r/>
             <w:r/>
           </w:p>
           <w:p>
@@ -4383,6 +4300,11 @@
                 <w:highlight w:val="none"/>
               </w:rPr>
             </w:r>
+            <w:r>
+              <w:rPr>
+                <w:highlight w:val="none"/>
+              </w:rPr>
+            </w:r>
           </w:p>
         </w:tc>
         <w:tc>
@@ -4399,11 +4321,9 @@
               <w:ind/>
               <w:rPr/>
             </w:pPr>
-            <w:r/>
             <w:r>
               <w:t xml:space="preserve">O middleware intercepta a requisição, nega o processamento e retorna o código de status HTTP 401 Unauthorized.</w:t>
             </w:r>
-            <w:r/>
             <w:r/>
           </w:p>
           <w:p>
@@ -4431,11 +4351,9 @@
               <w:ind/>
               <w:rPr/>
             </w:pPr>
-            <w:r/>
             <w:r>
               <w:t xml:space="preserve">Rota bloqueada com sucesso pelo middleware de segurança do backend quando sem token válido.</w:t>
             </w:r>
-            <w:r/>
             <w:r/>
           </w:p>
           <w:p>
@@ -4467,7 +4385,6 @@
             <w:r>
               <w:t xml:space="preserve">Passou</w:t>
             </w:r>
-            <w:r/>
             <w:r/>
           </w:p>
           <w:p>
@@ -4520,7 +4437,6 @@
               <w:t xml:space="preserve">/2026</w:t>
             </w:r>
             <w:r/>
-            <w:r/>
           </w:p>
           <w:p>
             <w:pPr>
@@ -4564,7 +4480,6 @@
         <w:rPr>
           <w:b/>
           <w:bCs/>
-          <w:highlight w:val="none"/>
         </w:rPr>
       </w:r>
     </w:p>
@@ -4596,6 +4511,7 @@
         <w:rPr>
           <w:b/>
           <w:bCs/>
+          <w:highlight w:val="none"/>
         </w:rPr>
       </w:r>
     </w:p>

</xml_diff>